<commit_message>
feat: Add new resources for COMPSCI4084 and COMPSCI5092; remove outdated IDSS_2024-25_main files
</commit_message>
<xml_diff>
--- a/materials/semester-1/COMPSCI4084-programming-systems/resources/Vim_and_the_C_toolchain.docx
+++ b/materials/semester-1/COMPSCI4084-programming-systems/resources/Vim_and_the_C_toolchain.docx
@@ -93,13 +93,8 @@
       <w:r>
         <w:t xml:space="preserve"> in C, compiling using </w:t>
       </w:r>
-      <w:proofErr w:type="spellStart"/>
-      <w:r>
-        <w:t>gcc</w:t>
-      </w:r>
-      <w:proofErr w:type="spellEnd"/>
-      <w:r>
-        <w:t xml:space="preserve"> and clang </w:t>
+      <w:r>
+        <w:t xml:space="preserve">gcc and clang </w:t>
       </w:r>
       <w:r>
         <w:t>and running it</w:t>
@@ -122,15 +117,7 @@
     </w:p>
     <w:p>
       <w:r>
-        <w:t xml:space="preserve">Learn how to edit, compile, run, and manage C programs using Vim, GCC/Clang, and </w:t>
-      </w:r>
-      <w:proofErr w:type="spellStart"/>
-      <w:r>
-        <w:t>Makefiles</w:t>
-      </w:r>
-      <w:proofErr w:type="spellEnd"/>
-      <w:r>
-        <w:t>.</w:t>
+        <w:t>Learn how to edit, compile, run, and manage C programs using Vim, GCC/Clang, and Makefiles.</w:t>
       </w:r>
     </w:p>
     <w:p/>
@@ -345,13 +332,8 @@
         <w:t xml:space="preserve"> of the file</w:t>
       </w:r>
       <w:r>
-        <w:t xml:space="preserve"> </w:t>
-      </w:r>
-      <w:proofErr w:type="spellStart"/>
-      <w:r>
-        <w:t>hello.c</w:t>
-      </w:r>
-      <w:proofErr w:type="spellEnd"/>
+        <w:t xml:space="preserve"> hello.c</w:t>
+      </w:r>
       <w:r>
         <w:t>:</w:t>
       </w:r>
@@ -509,68 +491,30 @@
       </w:r>
     </w:p>
     <w:p>
-      <w:proofErr w:type="spellStart"/>
       <w:r>
         <w:rPr>
           <w:b/>
           <w:bCs/>
         </w:rPr>
-        <w:t>gcc</w:t>
-      </w:r>
-      <w:proofErr w:type="spellEnd"/>
+        <w:t>gcc hello.c -o hello</w:t>
+      </w:r>
+      <w:r>
+        <w:t xml:space="preserve"> compile the program.</w:t>
+      </w:r>
+    </w:p>
+    <w:p>
       <w:r>
         <w:rPr>
           <w:b/>
           <w:bCs/>
         </w:rPr>
-        <w:t xml:space="preserve"> </w:t>
-      </w:r>
-      <w:proofErr w:type="spellStart"/>
-      <w:r>
-        <w:rPr>
-          <w:b/>
-          <w:bCs/>
-        </w:rPr>
-        <w:t>hello.c</w:t>
-      </w:r>
-      <w:proofErr w:type="spellEnd"/>
-      <w:r>
-        <w:rPr>
-          <w:b/>
-          <w:bCs/>
-        </w:rPr>
-        <w:t xml:space="preserve"> -o hello</w:t>
-      </w:r>
-      <w:r>
-        <w:t xml:space="preserve"> compile the program.</w:t>
+        <w:t xml:space="preserve">&amp;&amp; </w:t>
+      </w:r>
+      <w:r>
+        <w:t xml:space="preserve"> only run the next command if the first one succeeds.</w:t>
       </w:r>
     </w:p>
     <w:p>
-      <w:r>
-        <w:rPr>
-          <w:b/>
-          <w:bCs/>
-        </w:rPr>
-        <w:t>&amp;</w:t>
-      </w:r>
-      <w:proofErr w:type="gramStart"/>
-      <w:r>
-        <w:rPr>
-          <w:b/>
-          <w:bCs/>
-        </w:rPr>
-        <w:t xml:space="preserve">&amp; </w:t>
-      </w:r>
-      <w:r>
-        <w:t xml:space="preserve"> only</w:t>
-      </w:r>
-      <w:proofErr w:type="gramEnd"/>
-      <w:r>
-        <w:t xml:space="preserve"> run the next command if the first one succeeds.</w:t>
-      </w:r>
-    </w:p>
-    <w:p>
-      <w:proofErr w:type="gramStart"/>
       <w:r>
         <w:rPr>
           <w:b/>
@@ -579,11 +523,7 @@
         <w:t>./hello</w:t>
       </w:r>
       <w:r>
-        <w:t xml:space="preserve">  run</w:t>
-      </w:r>
-      <w:proofErr w:type="gramEnd"/>
-      <w:r>
-        <w:t xml:space="preserve"> the newly compiled program.</w:t>
+        <w:t xml:space="preserve">  run the newly compiled program.</w:t>
       </w:r>
     </w:p>
     <w:p/>
@@ -705,7 +645,6 @@
       <w:r>
         <w:t xml:space="preserve">It does the same job as </w:t>
       </w:r>
-      <w:proofErr w:type="spellStart"/>
       <w:r>
         <w:rPr>
           <w:b/>
@@ -713,7 +652,6 @@
         </w:rPr>
         <w:t>gcc</w:t>
       </w:r>
-      <w:proofErr w:type="spellEnd"/>
       <w:r>
         <w:t xml:space="preserve"> (the GNU Compiler Collection)</w:t>
       </w:r>
@@ -820,11 +758,9 @@
       <w:pPr>
         <w:pStyle w:val="Heading2"/>
       </w:pPr>
-      <w:proofErr w:type="spellStart"/>
       <w:r>
         <w:t>Makefile</w:t>
       </w:r>
-      <w:proofErr w:type="spellEnd"/>
     </w:p>
     <w:p>
       <w:r>
@@ -834,13 +770,8 @@
         <w:t xml:space="preserve"> file called</w:t>
       </w:r>
       <w:r>
-        <w:t xml:space="preserve"> </w:t>
-      </w:r>
-      <w:proofErr w:type="spellStart"/>
-      <w:r>
-        <w:t>Makefile</w:t>
-      </w:r>
-      <w:proofErr w:type="spellEnd"/>
+        <w:t xml:space="preserve"> Makefile</w:t>
+      </w:r>
       <w:r>
         <w:t>:</w:t>
       </w:r>
@@ -988,10 +919,63 @@
     </w:p>
     <w:p>
       <w:r>
+        <w:t>Create a file called security</w:t>
+      </w:r>
+      <w:r>
+        <w:t>1</w:t>
+      </w:r>
+      <w:r>
+        <w:t>.log with this content</w:t>
+      </w:r>
+      <w:r>
+        <w:t xml:space="preserve"> to see the output</w:t>
+      </w:r>
+      <w:r>
+        <w:t>:</w:t>
+      </w:r>
+    </w:p>
+    <w:p>
+      <w:r>
+        <w:t>cat &gt; security.log &lt;&lt; "EOF"</w:t>
+      </w:r>
+    </w:p>
+    <w:p>
+      <w:r>
+        <w:t>[2025-08-26 09:15:23] ALERT: Failed login from 192.168.1.20 on host WIN-SEC01 user=admin</w:t>
+      </w:r>
+    </w:p>
+    <w:p>
+      <w:r>
+        <w:t>[2025-08-26 09:20:05] INFO: User guest logged in from 10.0.0.5 on host WEB-SRV01</w:t>
+      </w:r>
+    </w:p>
+    <w:p>
+      <w:r>
+        <w:t>[2025-08-26 09:22:44] ALERT: Failed login from 172.16.0.12 on host DB-SRV03 user=root</w:t>
+      </w:r>
+    </w:p>
+    <w:p>
+      <w:r>
+        <w:lastRenderedPageBreak/>
+        <w:t>[2025-08-26 09:30:01] INFO: User alice logged in from 192.168.1.45 on host WIN-CLT07</w:t>
+      </w:r>
+    </w:p>
+    <w:p>
+      <w:r>
+        <w:t>[2025-08-26 09:45:33] ALERT: Suspicious activity from 203.0.113.77 on host MAIL-SRV02</w:t>
+      </w:r>
+    </w:p>
+    <w:p>
+      <w:r>
+        <w:t>[2025-08-26 09:50:17] INFO: User bob logged in from 192.168.1.100 on host WIN-CLT09</w:t>
+      </w:r>
+    </w:p>
+    <w:p/>
+    <w:p>
+      <w:r>
         <w:rPr>
           <w:noProof/>
         </w:rPr>
-        <w:lastRenderedPageBreak/>
         <w:drawing>
           <wp:inline distT="0" distB="0" distL="0" distR="0" wp14:anchorId="2F061DCB" wp14:editId="74ABCC10">
             <wp:extent cx="4629796" cy="3515216"/>

</xml_diff>